<commit_message>
scaffold full course skeleton: slides (11 module stubs) + labs (8 stubs) + lab infra
Slides pipeline (gen.sh + slide-list.txt) and 12 slide stubs (about + 4 intro + 7 intermediate)
seeded with agendas from outline.md. 8 lab stubs, one per hands-on module. Lab infra adapted
from Advanced-Kafka-Streaming: 3-broker KRaft compose + Schema Registry (:8081) + connect/
monitoring/flink profiles (Flink UI moved to :8082 to free 8081 for Schema Registry). README
updated with build instructions.
</commit_message>
<xml_diff>
--- a/Apache Kafka for Developers.docx
+++ b/Apache Kafka for Developers.docx
@@ -31,13 +31,8 @@
       <w:r>
         <w:rPr/>
         <w:t xml:space="preserve"> Introduction (1 day) + Intermediate (3 days) — deliverable together as a 4-day track or as two standalone courses. </w:t>
-      </w:r>
-    </w:p>
-    <w:p>
-      <w:pPr>
-        <w:pStyle w:val="FirstParagraph"/>
-        <w:rPr/>
-      </w:pPr>
+        <w:br/>
+      </w:r>
       <w:r>
         <w:rPr>
           <w:b/>
@@ -48,13 +43,8 @@
       <w:r>
         <w:rPr/>
         <w:t xml:space="preserve"> Introductory through Intermediate. Hands-on, lab-intensive. </w:t>
-      </w:r>
-    </w:p>
-    <w:p>
-      <w:pPr>
-        <w:pStyle w:val="FirstParagraph"/>
-        <w:rPr/>
-      </w:pPr>
+        <w:br/>
+      </w:r>
       <w:r>
         <w:rPr>
           <w:b/>
@@ -133,10 +123,10 @@
         <w:pStyle w:val="Heading2"/>
         <w:rPr/>
       </w:pPr>
-      <w:bookmarkStart w:id="1" w:name="overview"/>
-      <w:r>
-        <w:rPr/>
-        <w:t>Overview</w:t>
+      <w:bookmarkStart w:id="1" w:name="description"/>
+      <w:r>
+        <w:rPr/>
+        <w:t>Description</w:t>
       </w:r>
     </w:p>
     <w:p>
@@ -146,7 +136,7 @@
       </w:pPr>
       <w:r>
         <w:rPr/>
-        <w:t>Apache Kafka is the de-facto standard for real-time data streaming — fault-tolerant, horizontally scalable, and the backbone of modern event-driven architectures at LinkedIn, Uber, Netflix, and thousands of enterprises. This track takes participants from Kafka fundamentals through the intermediate developer skills needed to build production streaming applications: producers and consumers, delivery guarantees and exactly-once semantics, schema management, Kafka Connect pipelines, and stream processing.</w:t>
+        <w:t>Apache Kafka has become the backbone of real-time data infrastructure. It is a distributed, fault-tolerant, horizontally scalable streaming platform used by LinkedIn, Uber, Netflix, and thousands of enterprises to move and process data as it happens — powering event-driven microservices, log aggregation, analytics pipelines, and machine-learning feature stores. For developers building modern systems, working fluently with Kafka has become an essential skill.</w:t>
       </w:r>
     </w:p>
     <w:p>
@@ -156,39 +146,60 @@
       </w:pPr>
       <w:r>
         <w:rPr/>
-        <w:t xml:space="preserve">The course is </w:t>
+        <w:t>This hands-on course takes developers from Kafka fundamentals through the intermediate skills needed to build production streaming applications. It begins with a one-day introduction to the core concepts — topics, partitions, offsets, producers, consumers, and cluster architecture — and then moves into three days of intermediate, code-focused development: writing robust producers and consumers, choosing and configuring delivery guarantees (including exactly-once), managing schemas and their evolution with the Schema Registry, building data pipelines with Kafka Connect, and processing streams with Kafka Streams and Flink SQL.</w:t>
+      </w:r>
+    </w:p>
+    <w:p>
+      <w:pPr>
+        <w:pStyle w:val="BodyText"/>
+        <w:rPr/>
+      </w:pPr>
+      <w:r>
+        <w:rPr/>
+        <w:t xml:space="preserve">The course is current to </w:t>
       </w:r>
       <w:r>
         <w:rPr>
           <w:b/>
           <w:bCs/>
         </w:rPr>
-        <w:t>current to Apache Kafka 4</w:t>
-      </w:r>
-      <w:r>
-        <w:rPr/>
-        <w:t xml:space="preserve"> — ZooKeeper has been fully removed (KRaft), and the material reflects today’s ecosystem (Flink SQL, Schema Registry, modern client APIs) rather than legacy patterns.</w:t>
-      </w:r>
-    </w:p>
-    <w:p>
-      <w:pPr>
-        <w:pStyle w:val="BodyText"/>
-        <w:rPr/>
-      </w:pPr>
-      <w:r>
-        <w:rPr/>
-        <w:t xml:space="preserve">The emphasis is </w:t>
+        <w:t>Apache Kafka 4</w:t>
+      </w:r>
+      <w:r>
+        <w:rPr/>
+        <w:t xml:space="preserve">, which removed Apache ZooKeeper entirely in favor of the built-in </w:t>
       </w:r>
       <w:r>
         <w:rPr>
           <w:b/>
           <w:bCs/>
         </w:rPr>
-        <w:t>programming and hands-on practice</w:t>
-      </w:r>
-      <w:r>
-        <w:rPr/>
-        <w:t xml:space="preserve"> over cluster administration, with every concept reinforced by a lab. All labs run in a self-contained environment; all materials are provided in Git for participants to revisit and re-run afterward.</w:t>
+        <w:t>KRaft</w:t>
+      </w:r>
+      <w:r>
+        <w:rPr/>
+        <w:t xml:space="preserve"> consensus protocol. Participants learn today’s architecture and ecosystem rather than legacy patterns, and every concept is reinforced with a lab. The emphasis throughout is on </w:t>
+      </w:r>
+      <w:r>
+        <w:rPr>
+          <w:b/>
+          <w:bCs/>
+        </w:rPr>
+        <w:t>programming and practical application</w:t>
+      </w:r>
+      <w:r>
+        <w:rPr/>
+        <w:t xml:space="preserve"> over cluster administration, and all course materials — slides, labs, and code — are provided in a Git repository so participants can revisit and re-run the exercises after the course.</w:t>
+      </w:r>
+    </w:p>
+    <w:p>
+      <w:pPr>
+        <w:pStyle w:val="BodyText"/>
+        <w:rPr/>
+      </w:pPr>
+      <w:r>
+        <w:rPr/>
+        <w:t>The introductory day makes the course accessible to those new to Kafka, while the intermediate days provide the depth working developers need to be productive on real streaming projects.</w:t>
       </w:r>
       <w:bookmarkEnd w:id="1"/>
     </w:p>

</xml_diff>